<commit_message>
docs: correct V4 manual identity
</commit_message>
<xml_diff>
--- a/VehicleSoundSynthV4_完整使用手册.docx
+++ b/VehicleSoundSynthV4_完整使用手册.docx
@@ -78,7 +78,7 @@
           <w:color w:val="0B2545"/>
           <w:sz w:val="21"/>
         </w:rPr>
-        <w:t>手册版本 3.1  |  适用 Max 8.6.5  |  2026-08-11</w:t>
+        <w:t>手册版本 4.0  |  适用 Max 8.6.5  |  2026-08-12</w:t>
       </w:r>
     </w:p>
     <w:p>
@@ -93,7 +93,7 @@
           <w:color w:val="5B6573"/>
           <w:sz w:val="18"/>
         </w:rPr>
-        <w:t>项目分支：codex/vehicle-sound-v3  |  V1/V2 保持独立不变</w:t>
+        <w:t>项目分支：codex/vehicle-sound-v4  |  V1/V2/V3 保持独立不变</w:t>
       </w:r>
     </w:p>
     <w:p>

</xml_diff>

<commit_message>
docs: complete V4 Ferrari validation guide
</commit_message>
<xml_diff>
--- a/VehicleSoundSynthV4_完整使用手册.docx
+++ b/VehicleSoundSynthV4_完整使用手册.docx
@@ -4460,7 +4460,7 @@
                 <w:color w:val="1F2937"/>
                 <w:sz w:val="17"/>
               </w:rPr>
-              <w:t>本地去基频残差层，仅 V10/V12</w:t>
+              <w:t>本地双层去基频残差，仅 V10/V12</w:t>
             </w:r>
           </w:p>
         </w:tc>
@@ -4486,7 +4486,7 @@
                 <w:color w:val="1F2937"/>
                 <w:sz w:val="17"/>
               </w:rPr>
-              <w:t>250 ms stereo loop、-18 dBFS RMS；media/local 永不提交</w:t>
+              <w:t>1.0 s 起点/250 ms idle loop；22.75 s 起点/500 ms high-RPM loop；均为 -18 dBFS RMS，media/local 永不提交</w:t>
             </w:r>
           </w:p>
         </w:tc>
@@ -5523,6 +5523,8 @@
         <w:t>python3 -m unittest discover -s tests -v</w:t>
         <w:br/>
         <w:t>python3 tools/audio_metrics.py &lt;render.wav&gt; --max-peak-dbfs -1 --min-rms-dbfs -45 --min-rumble-ratio 0.55 --max-subsonic-ratio 0.05 --max-low-side-ratio 0.05 --min-low-band-correlation 0.95 --max-mono-fold-rms-loss-db 1.5 --max-high-ratio 0.10 --min-spectral-peaks 6 --max-dominant-peak-ratio 0.50</w:t>
+        <w:br/>
+        <w:t>python3 tools/audio_metrics.py &lt;high_rpm.wav&gt; --compare-wav &lt;ferrari_window.wav&gt; --min-third-octave-similarity-left 0.85 --min-third-octave-similarity-right 0.85 --min-third-octave-similarity 0.87 --max-third-octave-similarity-lr-delta 0.05</w:t>
       </w:r>
     </w:p>
     <w:p>

</xml_diff>